<commit_message>
feat: tournament per-division add-on (+$99) on /pricing
Mirrors the league division add-on. +$99 per additional division in the
same event, plus a "custom package pricing — contact us" note for big
multi-division operators (5+ divisions). Updates the live page, the
canonical pricing guide docx, and the §7 BIZ-TIER-2 ladder row.

Co-Authored-By: Claude Opus 4.7 (1M context) <noreply@anthropic.com>
</commit_message>
<xml_diff>
--- a/docs/Rinkd_Pricing_Guide.docx
+++ b/docs/Rinkd_Pricing_Guide.docx
@@ -1643,6 +1643,144 @@
                 <w:szCs w:val="21"/>
               </w:rPr>
               <w:t xml:space="preserve">Full tournament · live scores · bracket · push notifications</w:t>
+            </w:r>
+          </w:p>
+        </w:tc>
+      </w:tr>
+      <w:tr>
+        <w:tc>
+          <w:tcPr>
+            <w:tcW w:type="dxa" w:w="2400"/>
+            <w:tcBorders>
+              <w:top w:val="single" w:color="D0DCE8" w:sz="1"/>
+              <w:left w:val="single" w:color="D0DCE8" w:sz="1"/>
+              <w:bottom w:val="single" w:color="D0DCE8" w:sz="1"/>
+              <w:right w:val="single" w:color="D0DCE8" w:sz="1"/>
+            </w:tcBorders>
+            <w:shd w:fill="FFFFFF" w:val="clear"/>
+            <w:tcMar>
+              <w:top w:type="dxa" w:w="120"/>
+              <w:left w:type="dxa" w:w="160"/>
+              <w:bottom w:type="dxa" w:w="120"/>
+              <w:right w:type="dxa" w:w="160"/>
+            </w:tcMar>
+          </w:tcPr>
+          <w:p>
+            <w:pPr>
+              <w:spacing w:after="0"/>
+            </w:pPr>
+            <w:r>
+              <w:rPr>
+                <w:rFonts w:ascii="Arial" w:cs="Arial" w:eastAsia="Arial" w:hAnsi="Arial"/>
+                <w:b/>
+                <w:bCs/>
+                <w:color w:val="0B1F3A"/>
+                <w:sz w:val="21"/>
+                <w:szCs w:val="21"/>
+              </w:rPr>
+              <w:t xml:space="preserve">Division add-on</w:t>
+            </w:r>
+          </w:p>
+        </w:tc>
+        <w:tc>
+          <w:tcPr>
+            <w:tcW w:type="dxa" w:w="1800"/>
+            <w:tcBorders>
+              <w:top w:val="single" w:color="D0DCE8" w:sz="1"/>
+              <w:left w:val="single" w:color="D0DCE8" w:sz="1"/>
+              <w:bottom w:val="single" w:color="D0DCE8" w:sz="1"/>
+              <w:right w:val="single" w:color="D0DCE8" w:sz="1"/>
+            </w:tcBorders>
+            <w:shd w:fill="FFFFFF" w:val="clear"/>
+            <w:tcMar>
+              <w:top w:type="dxa" w:w="120"/>
+              <w:left w:type="dxa" w:w="160"/>
+              <w:bottom w:type="dxa" w:w="120"/>
+              <w:right w:type="dxa" w:w="160"/>
+            </w:tcMar>
+          </w:tcPr>
+          <w:p>
+            <w:pPr>
+              <w:spacing w:after="0"/>
+            </w:pPr>
+            <w:r>
+              <w:rPr>
+                <w:rFonts w:ascii="Arial" w:cs="Arial" w:eastAsia="Arial" w:hAnsi="Arial"/>
+                <w:b w:val="false"/>
+                <w:bCs w:val="false"/>
+                <w:color w:val="555566"/>
+                <w:sz w:val="21"/>
+                <w:szCs w:val="21"/>
+              </w:rPr>
+              <w:t xml:space="preserve">Per division</w:t>
+            </w:r>
+          </w:p>
+        </w:tc>
+        <w:tc>
+          <w:tcPr>
+            <w:tcW w:type="dxa" w:w="2160"/>
+            <w:tcBorders>
+              <w:top w:val="single" w:color="D0DCE8" w:sz="1"/>
+              <w:left w:val="single" w:color="D0DCE8" w:sz="1"/>
+              <w:bottom w:val="single" w:color="D0DCE8" w:sz="1"/>
+              <w:right w:val="single" w:color="D0DCE8" w:sz="1"/>
+            </w:tcBorders>
+            <w:shd w:fill="FFFFFF" w:val="clear"/>
+            <w:tcMar>
+              <w:top w:type="dxa" w:w="120"/>
+              <w:left w:type="dxa" w:w="160"/>
+              <w:bottom w:type="dxa" w:w="120"/>
+              <w:right w:type="dxa" w:w="160"/>
+            </w:tcMar>
+          </w:tcPr>
+          <w:p>
+            <w:pPr>
+              <w:spacing w:after="0"/>
+            </w:pPr>
+            <w:r>
+              <w:rPr>
+                <w:rFonts w:ascii="Arial" w:cs="Arial" w:eastAsia="Arial" w:hAnsi="Arial"/>
+                <w:b/>
+                <w:bCs/>
+                <w:color w:val="2E5B8C"/>
+                <w:sz w:val="21"/>
+                <w:szCs w:val="21"/>
+              </w:rPr>
+              <w:t xml:space="preserve">+$99</w:t>
+            </w:r>
+          </w:p>
+        </w:tc>
+        <w:tc>
+          <w:tcPr>
+            <w:tcW w:type="dxa" w:w="3000"/>
+            <w:tcBorders>
+              <w:top w:val="single" w:color="D0DCE8" w:sz="1"/>
+              <w:left w:val="single" w:color="D0DCE8" w:sz="1"/>
+              <w:bottom w:val="single" w:color="D0DCE8" w:sz="1"/>
+              <w:right w:val="single" w:color="D0DCE8" w:sz="1"/>
+            </w:tcBorders>
+            <w:shd w:fill="FFFFFF" w:val="clear"/>
+            <w:tcMar>
+              <w:top w:type="dxa" w:w="120"/>
+              <w:left w:type="dxa" w:w="160"/>
+              <w:bottom w:type="dxa" w:w="120"/>
+              <w:right w:type="dxa" w:w="160"/>
+            </w:tcMar>
+          </w:tcPr>
+          <w:p>
+            <w:pPr>
+              <w:spacing w:after="0"/>
+            </w:pPr>
+            <w:r>
+              <w:rPr>
+                <w:rFonts w:ascii="Arial" w:cs="Arial" w:eastAsia="Arial" w:hAnsi="Arial"/>
+                <w:b w:val="false"/>
+                <w:bCs w:val="false"/>
+                <w:color w:val="555566"/>
+                <w:sz w:val="21"/>
+                <w:szCs w:val="21"/>
+              </w:rPr>
+              <w:t xml:space="preserve">Additional division in the same event · custom packages for 5+ divisions — contact us</w:t>
             </w:r>
           </w:p>
         </w:tc>

</xml_diff>

<commit_message>
docs(pricing): add Rinkd Social section (Model D)
Appends an on-brand Rinkd Social section to the pricing guide: the community/
engagement layer for operators who keep their own scoring (GameSheet CSV import
or auto-sync). Model D pricing — <8 teams free, per-event $99/$249/$499 by team
count, or $1,500/yr operator Annual (unlimited tournaments + leagues + off-season
feed). Inserted via OOXML mirroring the doc's existing band + navy-table styling;
zip + XML validated, part set unchanged. (No LibreOffice here to render-eyeball —
worth a quick visual check.)

Co-Authored-By: Claude Opus 4.7 <noreply@anthropic.com>
</commit_message>
<xml_diff>
--- a/docs/Rinkd_Pricing_Guide.docx
+++ b/docs/Rinkd_Pricing_Guide.docx
@@ -2537,6 +2537,216 @@
         <w:t xml:space="preserve"/>
       </w:r>
     </w:p>
+    <w:p>
+      <w:pPr>
+        <w:spacing w:before="200"/>
+      </w:pPr>
+      <w:r>
+        <w:rPr>
+          <w:sz w:val="18"/>
+          <w:szCs w:val="18"/>
+        </w:rPr>
+        <w:t xml:space="preserve"/>
+      </w:r>
+    </w:p>
+    <w:tbl>
+      <w:tblPr>
+        <w:tblW w:type="dxa" w:w="9360"/>
+        <w:tblBorders>
+          <w:top w:val="none"/>
+          <w:left w:val="none"/>
+          <w:bottom w:val="none"/>
+          <w:right w:val="none"/>
+        </w:tblBorders>
+      </w:tblPr>
+      <w:tblGrid>
+        <w:gridCol w:w="9360"/>
+      </w:tblGrid>
+      <w:tr>
+        <w:tc>
+          <w:tcPr>
+            <w:tcW w:type="dxa" w:w="9360"/>
+            <w:tcBorders>
+              <w:top w:val="none"/>
+              <w:left w:val="none"/>
+              <w:bottom w:val="none"/>
+              <w:right w:val="none"/>
+            </w:tcBorders>
+            <w:shd w:fill="2E5B8C" w:val="clear"/>
+            <w:tcMar>
+              <w:top w:type="dxa" w:w="160"/>
+              <w:left w:type="dxa" w:w="400"/>
+              <w:bottom w:type="dxa" w:w="160"/>
+              <w:right w:type="dxa" w:w="400"/>
+            </w:tcMar>
+          </w:tcPr>
+          <w:p>
+            <w:pPr>
+              <w:spacing w:after="40"/>
+            </w:pPr>
+            <w:r>
+              <w:rPr>
+                <w:rFonts w:ascii="Arial" w:cs="Arial" w:eastAsia="Arial" w:hAnsi="Arial"/>
+                <w:b/>
+                <w:bCs/>
+                <w:color w:val="FFFFFF"/>
+                <w:spacing w:val="60"/>
+                <w:sz w:val="22"/>
+                <w:szCs w:val="22"/>
+              </w:rPr>
+              <w:t xml:space="preserve">RINKD SOCIAL</w:t>
+            </w:r>
+          </w:p>
+          <w:p>
+            <w:r>
+              <w:rPr>
+                <w:rFonts w:ascii="Arial" w:cs="Arial" w:eastAsia="Arial" w:hAnsi="Arial"/>
+                <w:color w:val="D5E3F0"/>
+                <w:sz w:val="18"/>
+                <w:szCs w:val="18"/>
+              </w:rPr>
+              <w:t xml:space="preserve">The community + engagement layer · keep your own scoring (GameSheet, etc.) · results sync into Rinkd automatically</w:t>
+            </w:r>
+          </w:p>
+        </w:tc>
+      </w:tr>
+    </w:tbl>
+    <w:p>
+      <w:pPr>
+        <w:spacing w:before="160" w:after="140"/>
+      </w:pPr>
+      <w:r>
+        <w:rPr>
+          <w:rFonts w:ascii="Arial" w:cs="Arial" w:eastAsia="Arial" w:hAnsi="Arial"/>
+          <w:color w:val="3A4654"/>
+          <w:sz w:val="20"/>
+          <w:szCs w:val="20"/>
+        </w:rPr>
+        <w:t xml:space="preserve">For operators who already run scoring elsewhere. Rinkd Social adds the live community layer GameSheet can’t — standings, stats, the social feed, game-recap push notifications, and chirps — all flowing off your imported results, additive alongside your existing registration and scoring. Import a CSV or auto-sync from GameSheet; Rinkd handles the rest.</w:t>
+      </w:r>
+    </w:p>
+    <w:tbl>
+      <w:tblPr>
+        <w:tblW w:type="dxa" w:w="9360"/>
+        <w:tblBorders>
+          <w:top w:val="none"/>
+          <w:left w:val="none"/>
+          <w:bottom w:val="none"/>
+          <w:right w:val="none"/>
+        </w:tblBorders>
+      </w:tblPr>
+      <w:tblGrid>
+        <w:gridCol w:w="9360"/>
+      </w:tblGrid>
+      <w:tr>
+        <w:tc>
+          <w:tcPr>
+            <w:tcW w:type="dxa" w:w="9360"/>
+            <w:tcBorders>
+              <w:top w:val="none"/>
+              <w:left w:val="none"/>
+              <w:bottom w:val="none"/>
+              <w:right w:val="none"/>
+            </w:tcBorders>
+            <w:shd w:fill="0B1F3A" w:val="clear"/>
+            <w:tcMar>
+              <w:top w:type="dxa" w:w="280"/>
+              <w:left w:type="dxa" w:w="480"/>
+              <w:bottom w:type="dxa" w:w="280"/>
+              <w:right w:type="dxa" w:w="480"/>
+            </w:tcMar>
+          </w:tcPr>
+          <w:p>
+            <w:pPr>
+              <w:spacing w:after="120"/>
+            </w:pPr>
+            <w:r>
+              <w:rPr>
+                <w:rFonts w:ascii="Arial" w:cs="Arial" w:eastAsia="Arial" w:hAnsi="Arial"/>
+                <w:b/>
+                <w:bCs/>
+                <w:color w:val="FFFFFF"/>
+                <w:sz w:val="22"/>
+                <w:szCs w:val="22"/>
+              </w:rPr>
+              <w:t xml:space="preserve">Under 8 teams</w:t>
+            </w:r>
+            <w:r>
+              <w:rPr>
+                <w:rFonts w:ascii="Arial" w:cs="Arial" w:eastAsia="Arial" w:hAnsi="Arial"/>
+                <w:color w:val="B0BAC7"/>
+                <w:sz w:val="22"/>
+                <w:szCs w:val="22"/>
+              </w:rPr>
+              <w:t xml:space="preserve">   —   Free   ·   grassroots loss-leader</w:t>
+            </w:r>
+          </w:p>
+          <w:p>
+            <w:pPr>
+              <w:spacing w:after="120"/>
+            </w:pPr>
+            <w:r>
+              <w:rPr>
+                <w:rFonts w:ascii="Arial" w:cs="Arial" w:eastAsia="Arial" w:hAnsi="Arial"/>
+                <w:b/>
+                <w:bCs/>
+                <w:color w:val="FFFFFF"/>
+                <w:sz w:val="22"/>
+                <w:szCs w:val="22"/>
+              </w:rPr>
+              <w:t xml:space="preserve">Per event</w:t>
+            </w:r>
+            <w:r>
+              <w:rPr>
+                <w:rFonts w:ascii="Arial" w:cs="Arial" w:eastAsia="Arial" w:hAnsi="Arial"/>
+                <w:color w:val="B0BAC7"/>
+                <w:sz w:val="22"/>
+                <w:szCs w:val="22"/>
+              </w:rPr>
+              <w:t xml:space="preserve">   —   $99 / $249 / $499   ·   by team count (small / mid / large event)</w:t>
+            </w:r>
+          </w:p>
+          <w:p>
+            <w:pPr>
+              <w:spacing w:after="120"/>
+            </w:pPr>
+            <w:r>
+              <w:rPr>
+                <w:rFonts w:ascii="Arial" w:cs="Arial" w:eastAsia="Arial" w:hAnsi="Arial"/>
+                <w:b/>
+                <w:bCs/>
+                <w:color w:val="FFFFFF"/>
+                <w:sz w:val="22"/>
+                <w:szCs w:val="22"/>
+              </w:rPr>
+              <w:t xml:space="preserve">Operator Annual</w:t>
+            </w:r>
+            <w:r>
+              <w:rPr>
+                <w:rFonts w:ascii="Arial" w:cs="Arial" w:eastAsia="Arial" w:hAnsi="Arial"/>
+                <w:color w:val="B0BAC7"/>
+                <w:sz w:val="22"/>
+                <w:szCs w:val="22"/>
+              </w:rPr>
+              <w:t xml:space="preserve">   —   $1,500 / year   ·   unlimited tournaments + leagues + off-season feed</w:t>
+            </w:r>
+          </w:p>
+          <w:p>
+            <w:r>
+              <w:rPr>
+                <w:rFonts w:ascii="Arial" w:cs="Arial" w:eastAsia="Arial" w:hAnsi="Arial"/>
+                <w:i/>
+                <w:iCs/>
+                <w:color w:val="8BA3BE"/>
+                <w:sz w:val="18"/>
+                <w:szCs w:val="18"/>
+              </w:rPr>
+              <w:t xml:space="preserve">Self-selecting: a busy operator picks Annual — a full season of events far exceeds $1,500. The 1% registration fee applies only if you also run registration through Rinkd.</w:t>
+            </w:r>
+          </w:p>
+        </w:tc>
+      </w:tr>
+    </w:tbl>
     <w:tbl>
       <w:tblPr>
         <w:tblW w:type="dxa" w:w="9360"/>

</xml_diff>

<commit_message>
chore(pricing-docx): genericize GameSheet → "your scoring platform"
Match the /pricing page scrub: the Rinkd Social section in the pricing guide no
longer names GameSheet. XML well-formed, part set unchanged.

Co-Authored-By: Claude Opus 4.7 <noreply@anthropic.com>
</commit_message>
<xml_diff>
--- a/docs/Rinkd_Pricing_Guide.docx
+++ b/docs/Rinkd_Pricing_Guide.docx
@@ -2605,7 +2605,7 @@
                 <w:sz w:val="18"/>
                 <w:szCs w:val="18"/>
               </w:rPr>
-              <w:t xml:space="preserve">The community + engagement layer · keep your own scoring (GameSheet, etc.) · results sync into Rinkd automatically</w:t>
+              <w:t xml:space="preserve">The community + engagement layer · keep your own scoring platform · results sync into Rinkd automatically</w:t>
             </w:r>
           </w:p>
         </w:tc>
@@ -2622,7 +2622,7 @@
           <w:sz w:val="20"/>
           <w:szCs w:val="20"/>
         </w:rPr>
-        <w:t xml:space="preserve">For operators who already run scoring elsewhere. Rinkd Social adds the live community layer GameSheet can’t — standings, stats, the social feed, game-recap push notifications, and chirps — all flowing off your imported results, additive alongside your existing registration and scoring. Import a CSV or auto-sync from GameSheet; Rinkd handles the rest.</w:t>
+        <w:t xml:space="preserve">For operators who already run scoring elsewhere. Rinkd Social adds the live community layer your scoring platform can’t — standings, stats, the social feed, game-recap push notifications, and chirps — all flowing off your imported results, additive alongside your existing registration and scoring. Import a CSV or auto-sync from your scoring platform; Rinkd handles the rest.</w:t>
       </w:r>
     </w:p>
     <w:tbl>

</xml_diff>

<commit_message>
feat: Rinkd Social pricing — Showcase tier ($999, 150+ teams), Annual scoped to single brand/region, Enterprise custom
</commit_message>
<xml_diff>
--- a/docs/Rinkd_Pricing_Guide.docx
+++ b/docs/Rinkd_Pricing_Guide.docx
@@ -2662,21 +2662,18 @@
             </w:pPr>
             <w:r>
               <w:rPr>
-                <w:rFonts w:ascii="Arial" w:cs="Arial" w:eastAsia="Arial" w:hAnsi="Arial"/>
-                <w:b/>
-                <w:bCs/>
+                <w:rFonts w:ascii="Arial" w:hAnsi="Arial"/>
+                <w:b/>
                 <w:color w:val="FFFFFF"/>
                 <w:sz w:val="22"/>
-                <w:szCs w:val="22"/>
-              </w:rPr>
-              <w:t xml:space="preserve">Under 8 teams</w:t>
-            </w:r>
-            <w:r>
-              <w:rPr>
-                <w:rFonts w:ascii="Arial" w:cs="Arial" w:eastAsia="Arial" w:hAnsi="Arial"/>
+              </w:rPr>
+              <w:t>Under 8 teams</w:t>
+            </w:r>
+            <w:r>
+              <w:rPr>
+                <w:rFonts w:ascii="Arial" w:hAnsi="Arial"/>
                 <w:color w:val="B0BAC7"/>
                 <w:sz w:val="22"/>
-                <w:szCs w:val="22"/>
               </w:rPr>
               <w:t xml:space="preserve">   —   Free   ·   grassroots loss-leader</w:t>
             </w:r>
@@ -2687,23 +2684,20 @@
             </w:pPr>
             <w:r>
               <w:rPr>
-                <w:rFonts w:ascii="Arial" w:cs="Arial" w:eastAsia="Arial" w:hAnsi="Arial"/>
-                <w:b/>
-                <w:bCs/>
+                <w:rFonts w:ascii="Arial" w:hAnsi="Arial"/>
+                <w:b/>
                 <w:color w:val="FFFFFF"/>
                 <w:sz w:val="22"/>
-                <w:szCs w:val="22"/>
-              </w:rPr>
-              <w:t xml:space="preserve">Per event</w:t>
-            </w:r>
-            <w:r>
-              <w:rPr>
-                <w:rFonts w:ascii="Arial" w:cs="Arial" w:eastAsia="Arial" w:hAnsi="Arial"/>
+              </w:rPr>
+              <w:t>Per event</w:t>
+            </w:r>
+            <w:r>
+              <w:rPr>
+                <w:rFonts w:ascii="Arial" w:hAnsi="Arial"/>
                 <w:color w:val="B0BAC7"/>
                 <w:sz w:val="22"/>
-                <w:szCs w:val="22"/>
-              </w:rPr>
-              <w:t xml:space="preserve">   —   $99 / $249 / $499   ·   by team count (small / mid / large event)</w:t>
+              </w:rPr>
+              <w:t xml:space="preserve">   —   $99 (up to 16 teams) / $249 (up to 24) / $499 (25–149)   ·   by team count</w:t>
             </w:r>
           </w:p>
           <w:p>
@@ -2712,36 +2706,77 @@
             </w:pPr>
             <w:r>
               <w:rPr>
-                <w:rFonts w:ascii="Arial" w:cs="Arial" w:eastAsia="Arial" w:hAnsi="Arial"/>
-                <w:b/>
-                <w:bCs/>
+                <w:rFonts w:ascii="Arial" w:hAnsi="Arial"/>
+                <w:b/>
                 <w:color w:val="FFFFFF"/>
                 <w:sz w:val="22"/>
-                <w:szCs w:val="22"/>
-              </w:rPr>
-              <w:t xml:space="preserve">Operator Annual</w:t>
-            </w:r>
-            <w:r>
-              <w:rPr>
-                <w:rFonts w:ascii="Arial" w:cs="Arial" w:eastAsia="Arial" w:hAnsi="Arial"/>
+              </w:rPr>
+              <w:t>Showcase</w:t>
+            </w:r>
+            <w:r>
+              <w:rPr>
+                <w:rFonts w:ascii="Arial" w:hAnsi="Arial"/>
                 <w:color w:val="B0BAC7"/>
                 <w:sz w:val="22"/>
-                <w:szCs w:val="22"/>
-              </w:rPr>
-              <w:t xml:space="preserve">   —   $1,500 / year   ·   unlimited tournaments + leagues + off-season feed</w:t>
-            </w:r>
-          </w:p>
-          <w:p>
-            <w:r>
-              <w:rPr>
-                <w:rFonts w:ascii="Arial" w:cs="Arial" w:eastAsia="Arial" w:hAnsi="Arial"/>
-                <w:i/>
-                <w:iCs/>
+              </w:rPr>
+              <w:t xml:space="preserve">   —   $999 / event   ·   150+ team mega-events</w:t>
+            </w:r>
+          </w:p>
+          <w:p>
+            <w:pPr>
+              <w:spacing w:after="120"/>
+            </w:pPr>
+            <w:r>
+              <w:rPr>
+                <w:rFonts w:ascii="Arial" w:hAnsi="Arial"/>
+                <w:b/>
+                <w:color w:val="FFFFFF"/>
+                <w:sz w:val="22"/>
+              </w:rPr>
+              <w:t>Operator Annual</w:t>
+            </w:r>
+            <w:r>
+              <w:rPr>
+                <w:rFonts w:ascii="Arial" w:hAnsi="Arial"/>
+                <w:color w:val="B0BAC7"/>
+                <w:sz w:val="22"/>
+              </w:rPr>
+              <w:t xml:space="preserve">   —   $1,500 / year   ·   one operator brand, single region — unlimited events + leagues + off-season feed</w:t>
+            </w:r>
+          </w:p>
+          <w:p>
+            <w:pPr>
+              <w:spacing w:after="120"/>
+            </w:pPr>
+            <w:r>
+              <w:rPr>
+                <w:rFonts w:ascii="Arial" w:hAnsi="Arial"/>
+                <w:b/>
+                <w:color w:val="FFFFFF"/>
+                <w:sz w:val="22"/>
+              </w:rPr>
+              <w:t>Enterprise</w:t>
+            </w:r>
+            <w:r>
+              <w:rPr>
+                <w:rFonts w:ascii="Arial" w:hAnsi="Arial"/>
+                <w:color w:val="B0BAC7"/>
+                <w:sz w:val="22"/>
+              </w:rPr>
+              <w:t xml:space="preserve">   —   custom   ·   multi-site / multi-region organizations — get in touch</w:t>
+            </w:r>
+          </w:p>
+          <w:p>
+            <w:pPr>
+              <w:spacing w:after="120"/>
+            </w:pPr>
+            <w:r>
+              <w:rPr>
+                <w:rFonts w:ascii="Arial" w:hAnsi="Arial"/>
                 <w:color w:val="8BA3BE"/>
                 <w:sz w:val="18"/>
-                <w:szCs w:val="18"/>
-              </w:rPr>
-              <w:t xml:space="preserve">Self-selecting: a busy operator picks Annual — a full season of events far exceeds $1,500. The 1% registration fee applies only if you also run registration through Rinkd.</w:t>
+              </w:rPr>
+              <w:t>One league season = one event tier. Per-event spaces stay live for 30 days after the event — Operator Annual keeps your community open year-round. Self-selecting: a busy operator picks Annual — a full season of events far exceeds $1,500. The 1% registration fee applies only if you also run registration through Rinkd.</w:t>
             </w:r>
           </w:p>
         </w:tc>

</xml_diff>